<commit_message>
Iteration2 full regression testing
</commit_message>
<xml_diff>
--- a/test/Iteration 2/01_Test_Strategy_and_Plan.docx
+++ b/test/Iteration 2/01_Test_Strategy_and_Plan.docx
@@ -21,7 +21,7 @@
     </w:p>
     <w:p>
       <w:r>
-        <w:t xml:space="preserve">This test pack assesses the Iteration 2 Plan baseline at commit f4cf763 on 15 September 2026. It covers Epic 4 Continue Learning, learning content and quiz progression; Epic 5 AI-assisted verification; Epic 6 chatbot; and Epic 8 ability use in battle. All 44 supplied Plan acceptance criteria now have an execution result. </w:t>
+        <w:t>This test pack assesses the current Iteration 2 Plan baseline at commit 1489a8b on 17 September 2026. It covers Epic 4 Continue Learning, learning content and quiz progression; Epic 5 AI-assisted verification; Epic 6 chatbot; and Epic 8 ability use in battle. All 44 current Plan acceptance criteria have a final execution result.</w:t>
       </w:r>
     </w:p>
     <w:p>
@@ -45,7 +45,7 @@
         <w:pStyle w:val="23"/>
       </w:pPr>
       <w:r>
-        <w:t>Backend/API regression: isolated SQLite pytest suite, including quiz, vision, chatbot, discovery and battle services.</w:t>
+        <w:t>Backend/API regression: isolated SQLite pytest suite covering quiz, vision, chatbot, discovery, activity, fun facts and battle services.</w:t>
       </w:r>
     </w:p>
     <w:p>
@@ -53,7 +53,7 @@
         <w:pStyle w:val="23"/>
       </w:pPr>
       <w:r>
-        <w:t>Frontend build checks: TypeScript compilation and Expo Web static export.</w:t>
+        <w:t>Frontend build checks: TypeScript compilation and Expo Web static export. A TypeScript finding is recorded separately if it does not change a functional acceptance result.</w:t>
       </w:r>
     </w:p>
     <w:p>
@@ -93,7 +93,7 @@
         <w:pStyle w:val="23"/>
       </w:pPr>
       <w:r>
-        <w:t>Exit: every Plan AC has a Pass or Fail result; each failure has a reproducible defect record; final Pass claims include current-build UI, API, or automated evidence.</w:t>
+        <w:t>Exit: every current Plan AC has a Pass, Fail or Not Run result; each failure has a reproducible defect record; final Pass claims include current-build UI, API or automated evidence.</w:t>
       </w:r>
     </w:p>
     <w:p>
@@ -101,23 +101,17 @@
         <w:pStyle w:val="23"/>
       </w:pPr>
       <w:r>
-        <w:t>Release gate: Must Have functional ACs must pass and critical/high defects must be resolved.</w:t>
+        <w:t>Release gate: Must Have functional ACs must pass and critical or high-severity defects must be resolved.</w:t>
       </w:r>
     </w:p>
     <w:p>
       <w:r>
-        <w:t>Current test object: master / f4cf76386f76a3d11abbee85db602fbbc22b0185 (Merge pull request #16 from Sitozzmonash/codex</w:t>
-      </w:r>
-      <w:bookmarkStart w:id="0" w:name="_GoBack"/>
-      <w:bookmarkEnd w:id="0"/>
-      <w:r>
-        <w:t>/epic6-whitelist-rag).</w:t>
+        <w:t>Current test object: origin/master / 1489a8bbcada64dfbdb7a2045a7c0aa0f46c8fd0 (fix quizzes gate undiscovered cards and skip-ahead submit).</w:t>
       </w:r>
     </w:p>
     <w:p>
-      <w:r>
-        <w:t>AC amendment record: on 15 September 2026, AC4.5.6 was amended to require a disabled Next button and no navigation until an answer is selected. The amended criterion does not require a no-answer message; its final result is Pass.</w:t>
-      </w:r>
+      <w:bookmarkStart w:id="0" w:name="_GoBack"/>
+      <w:bookmarkEnd w:id="0"/>
     </w:p>
     <w:sectPr>
       <w:pgSz w:w="12240" w:h="15840"/>

</xml_diff>

<commit_message>
full regression testing for iteration2 (#28)
* test for iteration 2

* Iteration2 full regression testing
</commit_message>
<xml_diff>
--- a/test/Iteration 2/01_Test_Strategy_and_Plan.docx
+++ b/test/Iteration 2/01_Test_Strategy_and_Plan.docx
@@ -21,7 +21,7 @@
     </w:p>
     <w:p>
       <w:r>
-        <w:t xml:space="preserve">This test pack assesses the Iteration 2 Plan baseline at commit f4cf763 on 15 September 2026. It covers Epic 4 Continue Learning, learning content and quiz progression; Epic 5 AI-assisted verification; Epic 6 chatbot; and Epic 8 ability use in battle. All 44 supplied Plan acceptance criteria now have an execution result. </w:t>
+        <w:t>This test pack assesses the current Iteration 2 Plan baseline at commit 1489a8b on 17 September 2026. It covers Epic 4 Continue Learning, learning content and quiz progression; Epic 5 AI-assisted verification; Epic 6 chatbot; and Epic 8 ability use in battle. All 44 current Plan acceptance criteria have a final execution result.</w:t>
       </w:r>
     </w:p>
     <w:p>
@@ -45,7 +45,7 @@
         <w:pStyle w:val="23"/>
       </w:pPr>
       <w:r>
-        <w:t>Backend/API regression: isolated SQLite pytest suite, including quiz, vision, chatbot, discovery and battle services.</w:t>
+        <w:t>Backend/API regression: isolated SQLite pytest suite covering quiz, vision, chatbot, discovery, activity, fun facts and battle services.</w:t>
       </w:r>
     </w:p>
     <w:p>
@@ -53,7 +53,7 @@
         <w:pStyle w:val="23"/>
       </w:pPr>
       <w:r>
-        <w:t>Frontend build checks: TypeScript compilation and Expo Web static export.</w:t>
+        <w:t>Frontend build checks: TypeScript compilation and Expo Web static export. A TypeScript finding is recorded separately if it does not change a functional acceptance result.</w:t>
       </w:r>
     </w:p>
     <w:p>
@@ -93,7 +93,7 @@
         <w:pStyle w:val="23"/>
       </w:pPr>
       <w:r>
-        <w:t>Exit: every Plan AC has a Pass or Fail result; each failure has a reproducible defect record; final Pass claims include current-build UI, API, or automated evidence.</w:t>
+        <w:t>Exit: every current Plan AC has a Pass, Fail or Not Run result; each failure has a reproducible defect record; final Pass claims include current-build UI, API or automated evidence.</w:t>
       </w:r>
     </w:p>
     <w:p>
@@ -101,23 +101,17 @@
         <w:pStyle w:val="23"/>
       </w:pPr>
       <w:r>
-        <w:t>Release gate: Must Have functional ACs must pass and critical/high defects must be resolved.</w:t>
+        <w:t>Release gate: Must Have functional ACs must pass and critical or high-severity defects must be resolved.</w:t>
       </w:r>
     </w:p>
     <w:p>
       <w:r>
-        <w:t>Current test object: master / f4cf76386f76a3d11abbee85db602fbbc22b0185 (Merge pull request #16 from Sitozzmonash/codex</w:t>
-      </w:r>
-      <w:bookmarkStart w:id="0" w:name="_GoBack"/>
-      <w:bookmarkEnd w:id="0"/>
-      <w:r>
-        <w:t>/epic6-whitelist-rag).</w:t>
+        <w:t>Current test object: origin/master / 1489a8bbcada64dfbdb7a2045a7c0aa0f46c8fd0 (fix quizzes gate undiscovered cards and skip-ahead submit).</w:t>
       </w:r>
     </w:p>
     <w:p>
-      <w:r>
-        <w:t>AC amendment record: on 15 September 2026, AC4.5.6 was amended to require a disabled Next button and no navigation until an answer is selected. The amended criterion does not require a no-answer message; its final result is Pass.</w:t>
-      </w:r>
+      <w:bookmarkStart w:id="0" w:name="_GoBack"/>
+      <w:bookmarkEnd w:id="0"/>
     </w:p>
     <w:sectPr>
       <w:pgSz w:w="12240" w:h="15840"/>

</xml_diff>